<commit_message>
Unify dialogue punctuation and split Tier-1 long paragraphs, then regen male narration for the 10 affected stems.
Co-authored-by: Cursor <cursoragent@cursor.com>
</commit_message>
<xml_diff>
--- a/az/stories/at-the-doctors-appointment.docx
+++ b/az/stories/at-the-doctors-appointment.docx
@@ -40,10 +40,7 @@
         </w:rPr>
       </w:pPr>
       <w:r>
-        <w:rPr>
-          <w:lang/>
-        </w:rPr>
-        <w:t>Gözlərindəki ifadə sanki "mən də acam, yemək istəyirəm" deyirdi. Ürəyim yandı. Bufetə qayıdıb bir sendviç, bir də alma suyu alıb ona verdim. Uşaq iştahla yeməyə başladı. Sevindim, öz-özümə dedim: "Nə yaxşı, bir adama xeyir verdim, savab qazandım."</w:t>
+        <w:t>Gözlərindəki ifadə sanki «mən də acam, yemək istəyirəm» deyirdi. Ürəyim yandı. Bufetə qayıdıb bir sendviç, bir də alma suyu alıb ona verdim. Uşaq iştahla yeməyə başladı. Sevindim, öz-özümə dedim: «Nə yaxşı, bir adama xeyir verdim, savab qazandım.»</w:t>
       </w:r>
     </w:p>
     <w:p>

</xml_diff>